<commit_message>
docs(pidi): selaraskan proposal & konsep video ke panduan resmi Tahap 3
Panduan resmi 3rd submission dibaca penuh, ekstrak ringkas ditambahkan.
Penyesuaian utama:
- Proposal (Jawaban Tahap 3 FINAL) diselaraskan ke nama field + batas kata resmi.
  Progress & Change Log dipangkas ke <=150 kata, label batas diperbaiki.
- Video: unlisted -> publik; durasi diperbaiki dari 3-5 menit ke 3 menit
  (1 menit pitch + 2 menit demo) sesuai struktur resmi.
- Jumlah unit test skor diperbarui 16 -> 19 (terverifikasi di branch v2).
- Ekstrak panduan resmi ditambahkan agar tidak perlu buka PDF 50MB tiap sesi.
- Proposal .docx diregenerasi dari markdown terbaru.
- MCP Supabase ditambahkan ke .mcp.json (untuk migrasi DB v2).
- PDF panduan resmi di-gitignore (bertanda "do not distribute").

Co-Authored-By: Claude Opus 4.8 (1M context) <noreply@anthropic.com>
</commit_message>
<xml_diff>
--- a/07 - Proposal & Submission/FIX FINAL SUBMISSION/Proposal FIX Tahap 3 - RetailMind AI.docx
+++ b/07 - Proposal & Submission/FIX FINAL SUBMISSION/Proposal FIX Tahap 3 - RetailMind AI.docx
@@ -37,7 +37,7 @@
         <w:t>[ISI ...]</w:t>
       </w:r>
       <w:r>
-        <w:t xml:space="preserve"> wajib dilengkapi pemilik sebelum submit. Landasan: DISKUSI v3 - Ready to Win, Strategi Validasi PMF, 07 - Validasi Ulang Perubahan v2 (Multi-Agent).</w:t>
+        <w:t xml:space="preserve"> wajib dilengkapi pemilik sebelum submit. Disusun mengikuti Panduan Tahap 3 (Ekstrak Resmi) (nama field dan batas kata resmi). Landasan: DISKUSI v3 - Ready to Win, Strategi Validasi PMF, 07 - Validasi Ulang Perubahan v2 (Multi-Agent).</w:t>
       </w:r>
     </w:p>
     <w:p>
@@ -217,7 +217,7 @@
     </w:p>
     <w:p>
       <w:r>
-        <w:t>Penajaman versi ini: model skor diperbaiki (belanja stok dihitung sebagai inventaris, bukan beban, lulus 16 dari 16 unit test), ditambah simulator dampak belanja untuk UMKM, dan dashboard pemodal difokuskan ke keputusan. Dampaknya: membuka akses pembiayaan bagi UMKM layak dan mempercepat penyaringan pemodal.</w:t>
+        <w:t>Penajaman versi ini: model skor diperbaiki (belanja stok dihitung sebagai inventaris, bukan beban, lulus 19 dari 19 unit test), ditambah simulator dampak belanja untuk UMKM, dan dashboard pemodal difokuskan ke keputusan. Dampaknya: membuka akses pembiayaan bagi UMKM layak dan mempercepat penyaringan pemodal.</w:t>
       </w:r>
     </w:p>
     <w:p>
@@ -225,12 +225,12 @@
         <w:pStyle w:val="Heading2"/>
       </w:pPr>
       <w:r>
-        <w:t>Progress and Change Log (168/200 kata)</w:t>
+        <w:t>Progress and Change Log (121/150 kata)</w:t>
       </w:r>
     </w:p>
     <w:p>
       <w:r>
-        <w:t>Perkembangan utama sejak 2nd submission, hasil validasi lanjutan dan perbaikan produk:</w:t>
+        <w:t>Perkembangan utama sejak 2nd submission, dari validasi lanjutan dan perbaikan produk:</w:t>
       </w:r>
     </w:p>
     <w:p>
@@ -244,7 +244,7 @@
         <w:t>Model skor diperbaiki dan diverifikasi.</w:t>
       </w:r>
       <w:r>
-        <w:t xml:space="preserve"> Belanja bahan baku dan kemasan kini dihitung sebagai inventaris (aset), tidak lagi memotong laba periode berjalan. Ini menutup cacat yang membuat UMKM musiman (menyetok besar jelang ramai) terbaca rugi dan skornya jatuh ke nol. Skor dihitung atas jendela bergerak, dan perbaikan lulus 16 dari 16 unit test.</w:t>
+        <w:t xml:space="preserve"> Belanja bahan baku dan kemasan kini dihitung sebagai inventaris, bukan beban, sehingga UMKM musiman yang menyetok besar tidak lagi terbaca rugi. Skor dihitung atas jendela bergerak dan lulus 19 dari 19 unit test.</w:t>
       </w:r>
     </w:p>
     <w:p>
@@ -272,7 +272,7 @@
         <w:t>Investor Dashboard difokuskan:</w:t>
       </w:r>
       <w:r>
-        <w:t xml:space="preserve"> peta lokasi yang sekadar pemanis dihapus, tampilan berpusat pada daftar UMKM, skor, dan Investment Readiness.</w:t>
+        <w:t xml:space="preserve"> peta yang sekadar pemanis dihapus, fokus ke daftar UMKM, skor, dan Investment Readiness.</w:t>
       </w:r>
     </w:p>
     <w:p>
@@ -286,7 +286,7 @@
         <w:t>Validasi diperluas ke sisi pemodal:</w:t>
       </w:r>
       <w:r>
-        <w:t xml:space="preserve"> ditambah persona bank dan investor, dan uji ulang seluruh perubahan.</w:t>
+        <w:t xml:space="preserve"> ditambah persona bank dan investor, plus uji ulang seluruh perubahan.</w:t>
       </w:r>
     </w:p>
     <w:p>
@@ -300,7 +300,7 @@
         <w:t>Kejujuran metode dipertegas:</w:t>
       </w:r>
       <w:r>
-        <w:t xml:space="preserve"> riset lapangan awal dipisahkan dari pra-validasi sintetis multi-agent, agar tidak terbaca lebih kuat dari kenyataannya.</w:t>
+        <w:t xml:space="preserve"> riset lapangan awal dipisahkan dari pra-validasi sintetis multi-agent.</w:t>
       </w:r>
     </w:p>
     <w:p>
@@ -311,10 +311,10 @@
         <w:rPr>
           <w:b/>
         </w:rPr>
-        <w:t>Strategi adopsi dinaikkan</w:t>
-      </w:r>
-      <w:r>
-        <w:t xml:space="preserve"> ke chat-first hibrida yang terbukti lewat PoC bot.</w:t>
+        <w:t>Strategi adopsi</w:t>
+      </w:r>
+      <w:r>
+        <w:t xml:space="preserve"> dinaikkan ke chat-first hibrida yang terbukti lewat PoC bot.</w:t>
       </w:r>
     </w:p>
     <w:p>
@@ -657,7 +657,7 @@
         <w:pStyle w:val="Heading2"/>
       </w:pPr>
       <w:r>
-        <w:t>Innovation Level (dropdown)</w:t>
+        <w:t>Innovation Level (dropdown, 42/50 kata)</w:t>
       </w:r>
     </w:p>
     <w:p>
@@ -716,7 +716,7 @@
         <w:pStyle w:val="ListBullet"/>
       </w:pPr>
       <w:r>
-        <w:t>Simulasi Belanja (What-If) dan perbaikan model skor v2 (inventaris vs beban), lulus 16 dari 16 unit test.</w:t>
+        <w:t>Simulasi Belanja (What-If) dan perbaikan model skor v2 (inventaris vs beban), lulus 19 dari 19 unit test.</w:t>
       </w:r>
     </w:p>
     <w:p>
@@ -1062,7 +1062,7 @@
         <w:t>Kedalaman rekayasa:</w:t>
       </w:r>
       <w:r>
-        <w:t xml:space="preserve"> logika skor teruji unit test (16 dari 16 lulus), abstraksi AI multi-provider dengan fallback rule-based, dan RLS multi-tenant. Perhitungan berat ada di Route Handler yang siap dijadikan API B2B.</w:t>
+        <w:t xml:space="preserve"> logika skor teruji unit test (19 dari 19 lulus), abstraksi AI multi-provider dengan fallback rule-based, dan RLS multi-tenant. Perhitungan berat ada di Route Handler yang siap dijadikan API B2B.</w:t>
       </w:r>
     </w:p>
     <w:p>
@@ -1070,7 +1070,7 @@
         <w:pStyle w:val="Heading2"/>
       </w:pPr>
       <w:r>
-        <w:t>Algorithm or Rule Quality and Decision Transparency (240/250 kata)</w:t>
+        <w:t>Algorithm or Rule Quality and Decision Transparency (240/300 kata)</w:t>
       </w:r>
     </w:p>
     <w:p>
@@ -1426,7 +1426,7 @@
         <w:pStyle w:val="ListBullet"/>
       </w:pPr>
       <w:r>
-        <w:t>Perbaikan model skor yang diverifikasi 16 unit test.</w:t>
+        <w:t>Perbaikan model skor yang diverifikasi 19 unit test.</w:t>
       </w:r>
     </w:p>
     <w:p>
@@ -1833,34 +1833,64 @@
         <w:pStyle w:val="Heading2"/>
       </w:pPr>
       <w:r>
-        <w:t>Video Submission</w:t>
+        <w:t>Video Submission (attachment)</w:t>
       </w:r>
     </w:p>
     <w:p>
       <w:r>
-        <w:t>[ISI link YouTube Elevator Pitch, format unlisted]. Bahan naskah siap: Naskah Pitch 60 Detik dan Script Video Pitch.</w:t>
-      </w:r>
-    </w:p>
-    <w:p>
-      <w:pPr>
-        <w:pStyle w:val="Heading2"/>
-      </w:pPr>
-      <w:r>
-        <w:t>Attachment</w:t>
-      </w:r>
-    </w:p>
-    <w:p>
-      <w:pPr>
-        <w:pStyle w:val="ListBullet"/>
-      </w:pPr>
+        <w:t xml:space="preserve">[ISI link YouTube Elevator Pitch]. </w:t>
+      </w:r>
       <w:r>
         <w:rPr>
           <w:b/>
         </w:rPr>
-        <w:t>Link demo (working prototype):</w:t>
-      </w:r>
-      <w:r>
-        <w:t xml:space="preserve"> [ISI URL deploy]</w:t>
+        <w:t>Wajib publik</w:t>
+      </w:r>
+      <w:r>
+        <w:t xml:space="preserve"> (bukan unlisted) dan maksimal 3 menit, sesuai Panduan Tahap 3 (Ekstrak Resmi). Konsep dan naskah per blok waktu: Konsep Video Elevator Pitch (Tahap 3).</w:t>
+      </w:r>
+    </w:p>
+    <w:p>
+      <w:pPr>
+        <w:pStyle w:val="Heading2"/>
+      </w:pPr>
+      <w:r>
+        <w:t>File Attachment (PDF) (attachment)</w:t>
+      </w:r>
+    </w:p>
+    <w:p>
+      <w:r>
+        <w:t xml:space="preserve">[ISI / ekspor proposal ke PDF, penamaan </w:t>
+      </w:r>
+      <w:r>
+        <w:rPr>
+          <w:rFonts w:ascii="Consolas" w:hAnsi="Consolas"/>
+        </w:rPr>
+        <w:t>S1100 - Judul Proposal</w:t>
+      </w:r>
+      <w:r>
+        <w:t>, maksimal 5MB]. Lampiran pendukung: diagram arsitektur, screenshot modul (POS, Cashbook, Health Score, AI Coach, Investor Dashboard), dan tabel before-after skor.</w:t>
+      </w:r>
+    </w:p>
+    <w:p>
+      <w:pPr>
+        <w:pStyle w:val="Heading2"/>
+      </w:pPr>
+      <w:r>
+        <w:t>Link Attachment (satu link publik) (attachment)</w:t>
+      </w:r>
+    </w:p>
+    <w:p>
+      <w:r>
+        <w:t>Demo working prototype: [ISI URL deploy, mis. https://retailmind-v2.vercel.app]. Akun demo: umkm@demo.com dan investor@demo.com (kata sandi demo123456). Pastikan bisa dibuka tanpa minta akses tambahan.</w:t>
+      </w:r>
+    </w:p>
+    <w:p>
+      <w:pPr>
+        <w:pStyle w:val="Heading2"/>
+      </w:pPr>
+      <w:r>
+        <w:t>CV Attachment (LinkedIn atau CV per anggota) (attachment)</w:t>
       </w:r>
     </w:p>
     <w:p>
@@ -1871,10 +1901,10 @@
         <w:rPr>
           <w:b/>
         </w:rPr>
-        <w:t>Akun demo:</w:t>
-      </w:r>
-      <w:r>
-        <w:t xml:space="preserve"> umkm@demo.com dan investor@demo.com (kata sandi: demo123456)</w:t>
+        <w:t>Ketua (Hamzah Arman Husni):</w:t>
+      </w:r>
+      <w:r>
+        <w:t xml:space="preserve"> [ISI link]</w:t>
       </w:r>
     </w:p>
     <w:p>
@@ -1885,10 +1915,10 @@
         <w:rPr>
           <w:b/>
         </w:rPr>
-        <w:t>File proposal (PDF, maksimal 5MB, penamaan S1100 - Judul Proposal):</w:t>
-      </w:r>
-      <w:r>
-        <w:t xml:space="preserve"> [ISI / ekspor dari deck]</w:t>
+        <w:t>Anggota (Dzaky Faishalariq):</w:t>
+      </w:r>
+      <w:r>
+        <w:t xml:space="preserve"> [ISI link]</w:t>
       </w:r>
     </w:p>
     <w:p>
@@ -1899,26 +1929,10 @@
         <w:rPr>
           <w:b/>
         </w:rPr>
-        <w:t>Portofolio tim:</w:t>
-      </w:r>
-      <w:r>
-        <w:t xml:space="preserve"> https://bit.ly/FinancialFreedomTeamHckaton</w:t>
-      </w:r>
-    </w:p>
-    <w:p>
-      <w:pPr>
-        <w:pStyle w:val="ListBullet"/>
-      </w:pPr>
-      <w:r>
-        <w:t>Pendukung: diagram arsitektur, screenshot modul (POS, Cashbook, Health Score, AI Coach, Investor Dashboard), tabel before-after skor.</w:t>
-      </w:r>
-    </w:p>
-    <w:p>
-      <w:pPr>
-        <w:pStyle w:val="Heading2"/>
-      </w:pPr>
-      <w:r>
-        <w:t>CV / Profil LinkedIn</w:t>
+        <w:t>Anggota (Gregorius Bugen Jovi Sitindaon):</w:t>
+      </w:r>
+      <w:r>
+        <w:t xml:space="preserve"> [ISI link]</w:t>
       </w:r>
     </w:p>
     <w:p>
@@ -1929,7 +1943,7 @@
         <w:rPr>
           <w:b/>
         </w:rPr>
-        <w:t>Ketua Tim (Hamzah Arman Husni):</w:t>
+        <w:t>Anggota (Aditya Nurrohman):</w:t>
       </w:r>
       <w:r>
         <w:t xml:space="preserve"> [ISI link]</w:t>
@@ -1940,41 +1954,7 @@
         <w:pStyle w:val="ListBullet"/>
       </w:pPr>
       <w:r>
-        <w:rPr>
-          <w:b/>
-        </w:rPr>
-        <w:t>Anggota 1 (Dzaky Faishalariq):</w:t>
-      </w:r>
-      <w:r>
-        <w:t xml:space="preserve"> [ISI link]</w:t>
-      </w:r>
-    </w:p>
-    <w:p>
-      <w:pPr>
-        <w:pStyle w:val="ListBullet"/>
-      </w:pPr>
-      <w:r>
-        <w:rPr>
-          <w:b/>
-        </w:rPr>
-        <w:t>Anggota 2 (Gregorius Bugen Jovi Sitindaon):</w:t>
-      </w:r>
-      <w:r>
-        <w:t xml:space="preserve"> [ISI link]</w:t>
-      </w:r>
-    </w:p>
-    <w:p>
-      <w:pPr>
-        <w:pStyle w:val="ListBullet"/>
-      </w:pPr>
-      <w:r>
-        <w:rPr>
-          <w:b/>
-        </w:rPr>
-        <w:t>Anggota 3 (Aditya Nurrohman):</w:t>
-      </w:r>
-      <w:r>
-        <w:t xml:space="preserve"> [ISI link]</w:t>
+        <w:t>Portofolio tim: https://bit.ly/FinancialFreedomTeamHckaton</w:t>
       </w:r>
     </w:p>
     <w:p>

</xml_diff>